<commit_message>
fix(veilles): réécrit le contrôle de décompte et corrige quatorze notes
Le test écrit le matin pour ai-act-veille, lancé sur les 85 veilles, aurait laissé
passer 11 des 12 décomptes faux et crié sur 4 notes justes : huit défauts, documentés
dans l'en-tête de outils/scripts/controle_decompte.py (nouveau fichier canonique, lit
cinq formats de liste et toutes les formes de décompte, exit 2 quand rien n'est comparé).

Quatorze notes actives corrigées (ai-act ×6, imac ×7, has-actualite ×1) : nombre aligné
sur la liste, marque datée dans le corps, formulation d'origine dans le journal, fiche
complétée. Test rejoué : exit 1 sur les sauvegardes, exit 0 après ; 50 cohérentes sur le
dépôt, 2 incohérentes (rgpd, archivées), 33 sans décompte à comparer.

Le prompt ai-act-veille appelle désormais le fichier au lieu d'un python3 -c.

Co-Authored-By: Claude Opus 5 <noreply@anthropic.com>
</commit_message>
<xml_diff>
--- a/sources/veille/2026-08-10_veille_has-actualite.docx
+++ b/sources/veille/2026-08-10_veille_has-actualite.docx
@@ -613,7 +613,7 @@
           <w:sz w:val="28"/>
           <w:szCs w:val="28"/>
         </w:rPr>
-        <w:t xml:space="preserve">📚 Sources — 4/6 sources documentaires exploitées</w:t>
+        <w:t xml:space="preserve">📚 Sources — 4/7 sources documentaires ouvertes, dont 3 reprises dans le corps (corrigé le 12/09/2026 — voir le journal des corrections)</w:t>
       </w:r>
     </w:p>
     <w:p>
@@ -711,7 +711,7 @@
           <w:sz w:val="22"/>
           <w:szCs w:val="22"/>
         </w:rPr>
-        <w:t xml:space="preserve">NB : la source CMV est ✅ au sens « ouverte et vérifiée » mais non reprise dans le corps car hors périmètre ESSMS — décompte : 3 sources ✅ effectivement reprises.</w:t>
+        <w:t xml:space="preserve">NB : la source CMV est ✅ au sens « ouverte et vérifiée » mais non reprise dans le corps car hors périmètre ESSMS — décompte : 4 ✅ ouvertes, dont 3 reprises dans le corps (corrigé le 12/09/2026 — voir le journal des corrections).</w:t>
       </w:r>
     </w:p>
     <w:p>
@@ -781,6 +781,52 @@
       </w:pPr>
       <w:r>
         <w:t xml:space="preserve"/>
+      </w:r>
+    </w:p>
+    <w:p>
+      <w:pPr>
+        <w:spacing w:after="120" w:before="320"/>
+      </w:pPr>
+      <w:r>
+        <w:rPr>
+          <w:rFonts w:ascii="Calibri" w:cs="Calibri" w:eastAsia="Calibri" w:hAnsi="Calibri"/>
+          <w:b/>
+          <w:bCs/>
+          <w:color w:val="1B3A6B"/>
+          <w:sz w:val="28"/>
+          <w:szCs w:val="28"/>
+        </w:rPr>
+        <w:t xml:space="preserve">📝 Journal des corrections — 12 septembre 2026</w:t>
+      </w:r>
+    </w:p>
+    <w:p>
+      <w:pPr>
+        <w:spacing w:after="80"/>
+      </w:pPr>
+      <w:r>
+        <w:rPr>
+          <w:rFonts w:ascii="Calibri" w:cs="Calibri" w:eastAsia="Calibri" w:hAnsi="Calibri"/>
+          <w:b/>
+          <w:bCs/>
+          <w:color w:val="1F2937"/>
+          <w:sz w:val="22"/>
+          <w:szCs w:val="22"/>
+        </w:rPr>
+        <w:t xml:space="preserve">Décompte des sources corrigé le 12/09/2026, au cours d'un contrôle des 85 veilles du dépôt (outils/scripts/controle_decompte.py). Le contenu de la note est inchangé ; seuls les nombres annoncés ont été alignés sur la liste des sources qu'elle contient. Formulation d'origine conservée ici.</w:t>
+      </w:r>
+    </w:p>
+    <w:p>
+      <w:pPr>
+        <w:spacing w:after="80"/>
+      </w:pPr>
+      <w:r>
+        <w:rPr>
+          <w:rFonts w:ascii="Calibri" w:cs="Calibri" w:eastAsia="Calibri" w:hAnsi="Calibri"/>
+          <w:color w:val="1F2937"/>
+          <w:sz w:val="22"/>
+          <w:szCs w:val="22"/>
+        </w:rPr>
+        <w:t xml:space="preserve">Version initiale : « 📚 Sources — 4/6 sources documentaires exploitées », puis en note « décompte : 3 sources ✅ effectivement reprises ». La rubrique liste quatre ✅ (grippe, PPA/DUI, appel à candidatures, CMV — cette dernière ouverte mais hors périmètre, donc non reprise) et trois pages consultées sans élément nouveau : sept sources tentées, non six ; quatre ouvertes, trois reprises. Trois nombres pour une liste — 4, 6, 3 — dont un seul juste.</w:t>
       </w:r>
     </w:p>
     <w:p>

</xml_diff>

<commit_message>
fix(veilles): douze liens manquants, ligne Bloomberg reformulée, test de décompte recollé
Contrôle des attributions sur les quatorze notes corrigées : cinq échouaient sur un seul
motif — des pages ⛔ ou « consultées sans élément » nommées sans lien, toutes en 200 pour
un navigateur (règle 6 : seuls 404 et 5xx interdisent le lien). Liens posés dans les cinq
docx ; la ligne « Source primaire : Gurman / Bloomberg » d'imac 30/08 dit désormais qu'elle
n'a pas été lue et renvoie aux relais liés. Journaux et fiches complétés.

controle_decompte.py : un lien posé au milieu d'une ligne la coupe en trois à l'extraction ;
le test recolle, et l'orientation statut/nom se calcule par sous-titre. Corpus inchangé
(50 · 2 · 33), exit 1 sur les quatorze sauvegardes.

Co-Authored-By: Claude Opus 5 <noreply@anthropic.com>
</commit_message>
<xml_diff>
--- a/sources/veille/2026-08-10_veille_has-actualite.docx
+++ b/sources/veille/2026-08-10_veille_has-actualite.docx
@@ -741,35 +741,98 @@
           <w:sz w:val="22"/>
           <w:szCs w:val="22"/>
         </w:rPr>
-        <w:t xml:space="preserve">• Page actualités HAS (has-sante.fr/jcms/fc_2874962) — consultée, aucun élément ESSMS dans la fenêtre</w:t>
-      </w:r>
-    </w:p>
-    <w:p>
-      <w:pPr>
-        <w:spacing w:after="60"/>
-      </w:pPr>
-      <w:r>
-        <w:rPr>
-          <w:rFonts w:ascii="Calibri" w:cs="Calibri" w:eastAsia="Calibri" w:hAnsi="Calibri"/>
-          <w:color w:val="1F2937"/>
-          <w:sz w:val="22"/>
-          <w:szCs w:val="22"/>
-        </w:rPr>
-        <w:t xml:space="preserve">• Section médico-social HAS (has-sante.fr/jcms/fc_1249588) — consultée, sans nouveauté dans la fenêtre</w:t>
-      </w:r>
-    </w:p>
-    <w:p>
-      <w:pPr>
-        <w:spacing w:after="60"/>
-      </w:pPr>
-      <w:r>
-        <w:rPr>
-          <w:rFonts w:ascii="Calibri" w:cs="Calibri" w:eastAsia="Calibri" w:hAnsi="Calibri"/>
-          <w:color w:val="1F2937"/>
-          <w:sz w:val="22"/>
-          <w:szCs w:val="22"/>
-        </w:rPr>
-        <w:t xml:space="preserve">• Productions programmées 2026 (has-sante.fr/jcms/c_1267303) — contenu partiel récupéré</w:t>
+        <w:t xml:space="preserve">• Page actualités HAS (</w:t>
+      </w:r>
+      <w:hyperlink w:history="1" r:id="rIdcorr2_630627">
+        <w:r>
+          <w:rPr>
+            <w:rFonts w:ascii="Calibri" w:cs="Calibri" w:eastAsia="Calibri" w:hAnsi="Calibri"/>
+            <w:color w:val="1155CC"/>
+            <w:sz w:val="22"/>
+            <w:szCs w:val="22"/>
+            <w:u w:val="single"/>
+          </w:rPr>
+          <w:t xml:space="preserve">has-sante.fr/jcms/fc_2874962</w:t>
+        </w:r>
+      </w:hyperlink>
+      <w:r>
+        <w:rPr>
+          <w:rFonts w:ascii="Calibri" w:cs="Calibri" w:eastAsia="Calibri" w:hAnsi="Calibri"/>
+          <w:color w:val="1F2937"/>
+          <w:sz w:val="22"/>
+          <w:szCs w:val="22"/>
+        </w:rPr>
+        <w:t xml:space="preserve">) — consultée, aucun élément ESSMS dans la fenêtre</w:t>
+      </w:r>
+    </w:p>
+    <w:p>
+      <w:pPr>
+        <w:spacing w:after="60"/>
+      </w:pPr>
+      <w:r>
+        <w:rPr>
+          <w:rFonts w:ascii="Calibri" w:cs="Calibri" w:eastAsia="Calibri" w:hAnsi="Calibri"/>
+          <w:color w:val="1F2937"/>
+          <w:sz w:val="22"/>
+          <w:szCs w:val="22"/>
+        </w:rPr>
+        <w:t xml:space="preserve">• Section médico-social HAS (</w:t>
+      </w:r>
+      <w:hyperlink w:history="1" r:id="rIdcorr1_689974">
+        <w:r>
+          <w:rPr>
+            <w:rFonts w:ascii="Calibri" w:cs="Calibri" w:eastAsia="Calibri" w:hAnsi="Calibri"/>
+            <w:color w:val="1155CC"/>
+            <w:sz w:val="22"/>
+            <w:szCs w:val="22"/>
+            <w:u w:val="single"/>
+          </w:rPr>
+          <w:t xml:space="preserve">has-sante.fr/jcms/fc_1249588</w:t>
+        </w:r>
+      </w:hyperlink>
+      <w:r>
+        <w:rPr>
+          <w:rFonts w:ascii="Calibri" w:cs="Calibri" w:eastAsia="Calibri" w:hAnsi="Calibri"/>
+          <w:color w:val="1F2937"/>
+          <w:sz w:val="22"/>
+          <w:szCs w:val="22"/>
+        </w:rPr>
+        <w:t xml:space="preserve">) — consultée, sans nouveauté dans la fenêtre</w:t>
+      </w:r>
+    </w:p>
+    <w:p>
+      <w:pPr>
+        <w:spacing w:after="60"/>
+      </w:pPr>
+      <w:r>
+        <w:rPr>
+          <w:rFonts w:ascii="Calibri" w:cs="Calibri" w:eastAsia="Calibri" w:hAnsi="Calibri"/>
+          <w:color w:val="1F2937"/>
+          <w:sz w:val="22"/>
+          <w:szCs w:val="22"/>
+        </w:rPr>
+        <w:t xml:space="preserve">• Productions programmées 2026 (</w:t>
+      </w:r>
+      <w:hyperlink w:history="1" r:id="rIdcorr0_503472">
+        <w:r>
+          <w:rPr>
+            <w:rFonts w:ascii="Calibri" w:cs="Calibri" w:eastAsia="Calibri" w:hAnsi="Calibri"/>
+            <w:color w:val="1155CC"/>
+            <w:sz w:val="22"/>
+            <w:szCs w:val="22"/>
+            <w:u w:val="single"/>
+          </w:rPr>
+          <w:t xml:space="preserve">has-sante.fr/jcms/c_1267303</w:t>
+        </w:r>
+      </w:hyperlink>
+      <w:r>
+        <w:rPr>
+          <w:rFonts w:ascii="Calibri" w:cs="Calibri" w:eastAsia="Calibri" w:hAnsi="Calibri"/>
+          <w:color w:val="1F2937"/>
+          <w:sz w:val="22"/>
+          <w:szCs w:val="22"/>
+        </w:rPr>
+        <w:t xml:space="preserve">) — contenu partiel récupéré</w:t>
       </w:r>
     </w:p>
     <w:p>
@@ -841,6 +904,20 @@
           <w:szCs w:val="22"/>
         </w:rPr>
         <w:t xml:space="preserve">Document généré automatiquement le 10 août 2026 — Pipeline RBPP / Claude Code.</w:t>
+      </w:r>
+    </w:p>
+    <w:p>
+      <w:pPr>
+        <w:spacing w:after="80"/>
+      </w:pPr>
+      <w:r>
+        <w:rPr>
+          <w:rFonts w:ascii="Calibri" w:cs="Calibri" w:eastAsia="Calibri" w:hAnsi="Calibri"/>
+          <w:color w:val="1F2937"/>
+          <w:sz w:val="22"/>
+          <w:szCs w:val="22"/>
+        </w:rPr>
+        <w:t xml:space="preserve">Liens ajoutés le 12/09/2026 (contrôle des attributions) : les trois pages HAS « consultées sans élément nouveau » (fc_2874962, fc_1249588, c_1267303) étaient nommées sans lien ; elles répondent 200. Texte inchangé.</w:t>
       </w:r>
     </w:p>
     <w:sectPr>

</xml_diff>